<commit_message>
Build portable Windows executable
Co-authored-by: Copilot <223556219+Copilot@users.noreply.github.com>
</commit_message>
<xml_diff>
--- a/expediente_generado/01-Acta_Remision_Generada.docx
+++ b/expediente_generado/01-Acta_Remision_Generada.docx
@@ -76,7 +76,7 @@
           <w:szCs w:val="24"/>
           <w:lang w:val="es-SV"/>
         </w:rPr>
-        <w:t xml:space="preserve">DOCE HORAS CON </w:t>
+        <w:t xml:space="preserve">QUINCE HORAS CON </w:t>
       </w:r>
       <w:proofErr w:type="gramStart"/>
       <w:r>
@@ -87,7 +87,7 @@
           <w:szCs w:val="24"/>
           <w:lang w:val="es-SV"/>
         </w:rPr>
-        <w:t xml:space="preserve">DIECIOCHO MINUTOS DEL DIA </w:t>
+        <w:t xml:space="preserve">QUINCE MINUTOS DEL DIA </w:t>
       </w:r>
       <w:proofErr w:type="gramStart"/>
       <w:r>
@@ -141,7 +141,7 @@
           <w:szCs w:val="24"/>
           <w:lang w:val="es-SV"/>
         </w:rPr>
-        <w:t xml:space="preserve">SUB-INSP. RIGOBERTO ANTONIO FIGUEROA ORELLANA con orden numérico institucional </w:t>
+        <w:t xml:space="preserve">AGTE. ROBERTO TOBIAS PEREZ CONCE con orden numérico institucional </w:t>
       </w:r>
       <w:proofErr w:type="gramStart"/>
       <w:r>
@@ -152,7 +152,7 @@
           <w:szCs w:val="24"/>
           <w:lang w:val="es-SV"/>
         </w:rPr>
-        <w:t xml:space="preserve">E-mil cuatrocientos treinta y siete y el </w:t>
+        <w:t xml:space="preserve">veintiseis mil quinientos noventa y tres y el </w:t>
       </w:r>
       <w:proofErr w:type="gramStart"/>
       <w:r>
@@ -195,7 +195,7 @@
           <w:szCs w:val="24"/>
           <w:lang w:val="es-SV"/>
         </w:rPr>
-        <w:t xml:space="preserve">el señor JUAN ANTONIO RIVERA de cuarenta y cuatro años de edad, de estado familiar Soltero, de profesión u oficio Jornalero, de nacionalidad Salvadoreña, residente en Comunidad los Almendros, Cantón Punta Remedios, municipio de Acajutla, con documento el cual manifestó no tener y llamarse como menciono previamente, hijo de Marcos Antonio Solis, </w:t>
+        <w:t xml:space="preserve">el señor JUAN ANTONIO RIVERA y quien es conocido por Tacuazin de cuarenta y cuatro años de edad, de estado familiar Soltero, de profesión u oficio Jornalero, de nacionalidad Salvadoreña, residente en Comunidad los Almendros, con documento cero seis ocho cinco uno cuatro ocho nueve guion ocho, hijo de Marcos Antonio y la señora Claudia Marlene Maravilla y quien es conocida por Hierva de Gato de cincuenta y seis años de edad, de estado familiar Acompañado, de profesión u oficio Jornalero, de nacionalidad Salvadoreño, residente en Comunidad los Almendros, con documento cero seis uno cuatro ocho cinco uno cero guion ocho, hija de Wilmer guzman, </w:t>
       </w:r>
       <w:proofErr w:type="gramStart"/>
       <w:r>
@@ -206,7 +206,7 @@
           <w:szCs w:val="24"/>
           <w:lang w:val="es-SV"/>
         </w:rPr>
-        <w:t xml:space="preserve">por atribuírsele la comisión del delito de LESIONES tipificado en el artículo ciento cuarenta y dos del Código Penal vigente, en perjuicio de </w:t>
+        <w:t xml:space="preserve">por atribuírsele al señor JUAN ANTONIO RIVERA la comisión del delito de LESIONES tipificado en el artículo ciento cuarenta y dos y a la señora Claudia Marlene Maravilla la comisión del delito de DAÑOS tipificado en el artículo ciento treinta y dos del Código Penal vigente, en perjuicio de </w:t>
       </w:r>
       <w:proofErr w:type="gramStart"/>
       <w:r>
@@ -217,7 +217,7 @@
           <w:szCs w:val="24"/>
           <w:lang w:val="es-SV"/>
         </w:rPr>
-        <w:t xml:space="preserve">la señora YOLANDA SANTAMARIA MARROQUÍN de cincuenta y dos años de edad, residente en Comunidad los Almendros, Cantón Punta Remedios, municipio de Acajutla, identificada con documento único de identidad número . HECHO OCURRIDO de la siguiente forma: </w:t>
+        <w:t xml:space="preserve">el señor La Salud Publica de  años de edad, residente en , identificado con documento único de identidad número . HECHO OCURRIDO de la siguiente forma: </w:t>
       </w:r>
       <w:proofErr w:type="gramStart"/>
       <w:r>
@@ -239,7 +239,7 @@
           <w:szCs w:val="24"/>
           <w:lang w:val="es-SV"/>
         </w:rPr>
-        <w:t xml:space="preserve">le manifestó a </w:t>
+        <w:t xml:space="preserve">les manifestó a </w:t>
       </w:r>
       <w:proofErr w:type="gramStart"/>
       <w:r>
@@ -250,7 +250,7 @@
           <w:szCs w:val="24"/>
           <w:lang w:val="es-SV"/>
         </w:rPr>
-        <w:t xml:space="preserve">el señor JUAN ANTONIO RIVERA que </w:t>
+        <w:t xml:space="preserve">el señor JUAN ANTONIO RIVERA y la señora Claudia Marlene Maravilla que </w:t>
       </w:r>
       <w:proofErr w:type="gramStart"/>
       <w:r>
@@ -261,7 +261,7 @@
           <w:szCs w:val="24"/>
           <w:lang w:val="es-SV"/>
         </w:rPr>
-        <w:t xml:space="preserve">quedaría </w:t>
+        <w:t xml:space="preserve">quedarían </w:t>
       </w:r>
       <w:proofErr w:type="gramStart"/>
       <w:r>
@@ -272,7 +272,7 @@
           <w:szCs w:val="24"/>
           <w:lang w:val="es-SV"/>
         </w:rPr>
-        <w:t xml:space="preserve">detenido </w:t>
+        <w:t xml:space="preserve">detenidos </w:t>
       </w:r>
       <w:proofErr w:type="gramStart"/>
       <w:r>
@@ -283,7 +283,7 @@
           <w:szCs w:val="24"/>
           <w:lang w:val="es-SV"/>
         </w:rPr>
-        <w:t xml:space="preserve">por el delito de LESIONES tipificado en el artículo ciento cuarenta y dos del Código Penal vigente. Al momento de la detención se le hicieron saber sus Derechos de manera inmediata y comprensible de conformidad a lo prescrito en el Artículo doce de la Constitución de la República y el Artículo ochenta y dos del código procesal penal; al preguntarle si nombraría a un abogado para que le asista en las presentes diligencias este manifestó que NO, por carecer de recursos económicos, por lo que se le manifestó que se le solicitará un defensor a la Procuraduría General de la República para que lo represente durante el proceso. Asimismo:</w:t>
+        <w:t xml:space="preserve">por los delitos antes relacionados. Al momento de la detención se les hicieron saber sus Derechos de manera inmediata y comprensible de conformidad a lo prescrito en el Artículo doce de la Constitución de la República y el Artículo ochenta y dos del código procesal penal; al preguntarles si nombrarían a un abogado para que les asista en las presentes diligencias estos manifestaron que NO, por carecer de recursos económicos, por lo que se les manifestó que se les solicitará un defensor a la Procuraduría General de la República para que los represente durante el proceso. Asimismo:</w:t>
       </w:r>
       <w:r>
         <w:rPr>
@@ -304,7 +304,7 @@
           <w:szCs w:val="24"/>
           <w:lang w:val="es-SV"/>
         </w:rPr>
-        <w:t xml:space="preserve">el señor JUAN ANTONIO RIVERA designó que se le avise de su detención a su hermana de nombre Enma Rivera. No quedando nada en incautación ni depósito. Por lo que se remite quedando en las </w:t>
+        <w:t xml:space="preserve">el señor JUAN ANTONIO RIVERA designó que se le avise de su detención a su hermana de nombre Enma Rivera. la señora Claudia Marlene Maravilla designó que se le avise de su detención a su hermano de nombre Maicol. No quedando nada en incautación ni depósito. Por lo que se remite quedando en las </w:t>
       </w:r>
       <w:proofErr w:type="gramStart"/>
       <w:r>
@@ -326,7 +326,7 @@
           <w:szCs w:val="24"/>
           <w:lang w:val="es-SV"/>
         </w:rPr>
-        <w:t xml:space="preserve">el detenido por negarse a hacerlo.</w:t>
+        <w:t xml:space="preserve">los detenidos por negarse a hacerlo.</w:t>
       </w:r>
     </w:p>
     <w:p>
@@ -499,6 +499,93 @@
           <w:lang w:val="es-SV"/>
         </w:rPr>
         <w:t xml:space="preserve">DETENIDO)</w:t>
+      </w:r>
+    </w:p>
+    <w:p>
+      <w:pPr>
+        <w:jc w:val="center"/>
+        <w:rPr>
+          <w:sz w:val="24"/>
+          <w:szCs w:val="24"/>
+        </w:rPr>
+      </w:pPr>
+      <w:r>
+        <w:rPr>
+          <w:rFonts w:ascii="Arial" w:hAnsi="Arial"/>
+          <w:b/>
+          <w:sz w:val="24"/>
+          <w:szCs w:val="24"/>
+          <w:lang w:val="es-SV"/>
+        </w:rPr>
+        <w:t xml:space="preserve"/>
+      </w:r>
+    </w:p>
+    <w:p>
+      <w:pPr>
+        <w:jc w:val="center"/>
+        <w:rPr>
+          <w:rFonts w:ascii="Arial" w:hAnsi="Arial"/>
+          <w:b/>
+          <w:sz w:val="24"/>
+          <w:szCs w:val="24"/>
+          <w:lang w:val="es-SV"/>
+        </w:rPr>
+      </w:pPr>
+    </w:p>
+    <w:p>
+      <w:pPr>
+        <w:jc w:val="center"/>
+        <w:rPr>
+          <w:rFonts w:ascii="Arial" w:hAnsi="Arial"/>
+          <w:b/>
+          <w:sz w:val="24"/>
+          <w:szCs w:val="24"/>
+          <w:lang w:val="es-SV"/>
+        </w:rPr>
+      </w:pPr>
+      <w:r>
+        <w:rPr>
+          <w:rFonts w:ascii="Arial" w:hAnsi="Arial"/>
+          <w:b/>
+          <w:sz w:val="24"/>
+          <w:szCs w:val="24"/>
+          <w:lang w:val="es-SV"/>
+        </w:rPr>
+        <w:t xml:space="preserve">F______________________</w:t>
+      </w:r>
+    </w:p>
+    <w:p>
+      <w:pPr>
+        <w:jc w:val="center"/>
+        <w:rPr>
+          <w:rFonts w:ascii="Arial" w:hAnsi="Arial"/>
+          <w:b/>
+          <w:sz w:val="24"/>
+          <w:szCs w:val="24"/>
+          <w:lang w:val="es-SV"/>
+        </w:rPr>
+      </w:pPr>
+      <w:proofErr w:type="gramStart"/>
+      <w:r>
+        <w:rPr>
+          <w:rFonts w:ascii="Arial" w:hAnsi="Arial"/>
+          <w:b/>
+          <w:sz w:val="24"/>
+          <w:szCs w:val="24"/>
+          <w:lang w:val="es-SV"/>
+        </w:rPr>
+        <w:t xml:space="preserve">Claudia Marlene Maravilla (</w:t>
+      </w:r>
+      <w:proofErr w:type="gramStart"/>
+      <w:r>
+        <w:rPr>
+          <w:rFonts w:ascii="Arial" w:hAnsi="Arial"/>
+          <w:b/>
+          <w:sz w:val="24"/>
+          <w:szCs w:val="24"/>
+          <w:lang w:val="es-SV"/>
+        </w:rPr>
+        <w:t xml:space="preserve">DETENIDA)</w:t>
       </w:r>
     </w:p>
     <w:p>

</xml_diff>